<commit_message>
Corregir orientacion: el norte real esta 7 grados al este
Todo el proyecto asumia el norte 7 grados al oeste. Se recalcularon zonas de sombra, corrimientos y techo con calculos/sombra_orientacion.py y se actualizaron la presentacion, los dos docx, el sol, la flecha N y el contorno de la zona en los .blend, y los renders de ideas iniciales.
</commit_message>
<xml_diff>
--- a/Ideas_para_techar_el_patio.docx
+++ b/Ideas_para_techar_el_patio.docx
@@ -115,7 +115,7 @@
         <w:t xml:space="preserve">Imprescindible: </w:t>
       </w:r>
       <w:r>
-        <w:t xml:space="preserve">la zona que nunca tiene sombra, de 23,5 × 14,8 m (348 m²).</w:t>
+        <w:t>la zona que nunca tiene sombra, de 23,4 × 14,5 m (340 m²).</w:t>
       </w:r>
     </w:p>
     <w:p>
@@ -135,7 +135,7 @@
         <w:t xml:space="preserve">Ideal: </w:t>
       </w:r>
       <w:r>
-        <w:t xml:space="preserve">todo el frente sin sombra fija, de 40,9 × 17,4 m (712 m²).</w:t>
+        <w:t>todo el frente sin sombra fija, de 40,9 × 16,2 m (661 m²).</w:t>
       </w:r>
     </w:p>
     <w:p>
@@ -155,7 +155,7 @@
         <w:t xml:space="preserve">No hace falta: </w:t>
       </w:r>
       <w:r>
-        <w:t xml:space="preserve">la banda de 7 m junto a la pared norte, que tiene sombra todo el evento.</w:t>
+        <w:t>la banda de 8,3 m junto a la pared norte, que tiene sombra todo el evento.</w:t>
       </w:r>
     </w:p>
     <w:p>
@@ -171,7 +171,7 @@
         <w:spacing w:after="120"/>
       </w:pPr>
       <w:r>
-        <w:t xml:space="preserve">Un techo elevado no da sombra justo debajo: el sol viene del norte, así que su sombra cae hacia el sur y, a la tarde, hacia el este. A 4 m de altura, la sombra se corre unos 2 m al sur y hasta 2,7 m al este. Por eso el techo tiene que ir corrido hacia el norte y el oeste respecto de la zona a proteger.</w:t>
+        <w:t>Un techo elevado no da sombra justo debajo: el sol viene del norte, así que su sombra cae hacia el sur; a la mañana se corre un poco al oeste y a la tarde, hacia el este. A 4 m de altura, la sombra se corre unos 2 m al sur, hasta 1,4 m al oeste y hasta 2,2 m al este. Por eso el techo tiene que ir corrido hacia el norte y ser más ancho que la zona a proteger, sobre todo del lado oeste.</w:t>
       </w:r>
     </w:p>
     <w:p>
@@ -233,7 +233,7 @@
           <w:sz w:val="18"/>
           <w:szCs w:val="18"/>
         </w:rPr>
-        <w:t xml:space="preserve">Para cubrir la zona sin sombra con un techo a 4 m: 27,1 × 15,3 m, a 10,2 m de la pared oeste y 1,5 m hacia adentro desde el borde abierto.</w:t>
+        <w:t>Para cubrir la zona sin sombra con un techo a 4 m: 27,1 × 14,8 m, a 8,5 m de la pared oeste y 1,7 m hacia adentro desde el borde abierto.</w:t>
       </w:r>
     </w:p>
     <w:p>
@@ -241,7 +241,7 @@
         <w:spacing w:after="120"/>
       </w:pPr>
       <w:r>
-        <w:t xml:space="preserve">Cuanto más alto esté el techo, más se corre la sombra (a 6 m, hasta 3 m al sur y 4 m al este). Conviene fijar la altura con la constructora y recalcular la posición.</w:t>
+        <w:t>Cuanto más alto esté el techo, más se corre la sombra (a 6 m, hasta 3 m al sur, 3,4 m al este y 2,1 m al oeste). Conviene fijar la altura con la constructora y recalcular la posición.</w:t>
       </w:r>
     </w:p>
     <w:p>
@@ -340,7 +340,7 @@
         <w:t xml:space="preserve">Por qué sirve: </w:t>
       </w:r>
       <w:r>
-        <w:t xml:space="preserve">Es la opción más barata por metro cuadrado y la única que cubre los 712 m² del frente completo con pocos apoyos. Los materiales son estándar y cualquier constructora los consigue rápido.</w:t>
+        <w:t>Es la opción más barata por metro cuadrado y la única que cubre los 661 m² del frente completo con pocos apoyos. Los materiales son estándar y cualquier constructora los consigue rápido.</w:t>
       </w:r>
     </w:p>
     <w:p>
@@ -431,7 +431,7 @@
         <w:t xml:space="preserve">Qué es: </w:t>
       </w:r>
       <w:r>
-        <w:t xml:space="preserve">Gazebos de 3 × 3 m o 3 × 6 m, alquilados o prestados, colocados uno al lado del otro. Para 348 m² hacen falta unos 20 de 3 × 6 m.</w:t>
+        <w:t>Gazebos de 3 × 3 m o 3 × 6 m, alquilados o prestados, colocados uno al lado del otro. Para 340 m² hacen falta unos 20 de 3 × 6 m.</w:t>
       </w:r>
     </w:p>
     <w:p>
@@ -514,7 +514,7 @@
         <w:t xml:space="preserve">A tener en cuenta: </w:t>
       </w:r>
       <w:r>
-        <w:t xml:space="preserve">La cobertura no es continua: para 348 m² harían falta entre 15 y 20. Son sensibles al viento y hay que cerrarlas si sopla fuerte.</w:t>
+        <w:t>La cobertura no es continua: para 340 m² harían falta entre 15 y 20. Son sensibles al viento y hay que cerrarlas si sopla fuerte.</w:t>
       </w:r>
     </w:p>
     <w:p>
@@ -1648,7 +1648,7 @@
         <w:t xml:space="preserve">Toldos retráctiles de pared: </w:t>
       </w:r>
       <w:r>
-        <w:t xml:space="preserve">llegan a 6–7 m de proyección y la zona sin sombra está a 13 m o más de las paredes laterales. Solo cubrirían franjas que ya tienen sombra parte del tiempo.</w:t>
+        <w:t>llegan a 6–7 m de proyección y la zona sin sombra está a 10,8 m de la pared oeste y a 6,7 m de la este. Del lado este apenas llegarían al borde de la zona; en la práctica solo cubrirían franjas que ya tienen sombra parte del tiempo.</w:t>
       </w:r>
     </w:p>
     <w:p>

</xml_diff>